<commit_message>
Add deeper POI analysis and final course materials
</commit_message>
<xml_diff>
--- a/docs/deliverables/AI辅助过程附件.docx
+++ b/docs/deliverables/AI辅助过程附件.docx
@@ -28,7 +28,7 @@
           <w:b w:val="0"/>
           <w:sz w:val="24"/>
         </w:rPr>
-        <w:t>项目：沪上流动——上海地铁客流时空规律分析与可视化系统。执行工具：OpenAI Codex。记录日期：2026年9月4日。本文是已有证据的整理，不是补造的开发日记。</w:t>
+        <w:t>项目：沪上流动——上海地铁客流时空规律分析与可视化系统。执行工具：OpenAI Codex。记录日期：2026年9月4日至7日。本文是已有证据的整理，不是补造的开发日记。</w:t>
       </w:r>
     </w:p>
     <w:p>
@@ -259,6 +259,7 @@
       <w:tr>
         <w:trPr>
           <w:tblHeader/>
+          <w:cantSplit/>
         </w:trPr>
         <w:tc>
           <w:tcPr>
@@ -338,6 +339,9 @@
         </w:tc>
       </w:tr>
       <w:tr>
+        <w:trPr>
+          <w:cantSplit/>
+        </w:trPr>
         <w:tc>
           <w:tcPr>
             <w:tcW w:type="dxa" w:w="1750"/>
@@ -416,6 +420,9 @@
         </w:tc>
       </w:tr>
       <w:tr>
+        <w:trPr>
+          <w:cantSplit/>
+        </w:trPr>
         <w:tc>
           <w:tcPr>
             <w:tcW w:type="dxa" w:w="1750"/>
@@ -494,6 +501,9 @@
         </w:tc>
       </w:tr>
       <w:tr>
+        <w:trPr>
+          <w:cantSplit/>
+        </w:trPr>
         <w:tc>
           <w:tcPr>
             <w:tcW w:type="dxa" w:w="1750"/>
@@ -572,6 +582,9 @@
         </w:tc>
       </w:tr>
       <w:tr>
+        <w:trPr>
+          <w:cantSplit/>
+        </w:trPr>
         <w:tc>
           <w:tcPr>
             <w:tcW w:type="dxa" w:w="1750"/>
@@ -650,6 +663,9 @@
         </w:tc>
       </w:tr>
       <w:tr>
+        <w:trPr>
+          <w:cantSplit/>
+        </w:trPr>
         <w:tc>
           <w:tcPr>
             <w:tcW w:type="dxa" w:w="1750"/>
@@ -727,6 +743,128 @@
           </w:p>
         </w:tc>
       </w:tr>
+      <w:tr>
+        <w:trPr>
+          <w:cantSplit/>
+        </w:trPr>
+        <w:tc>
+          <w:tcPr>
+            <w:tcW w:type="dxa" w:w="1750"/>
+          </w:tcPr>
+          <w:p>
+            <w:r>
+              <w:rPr>
+                <w:rFonts w:ascii="Times New Roman" w:hAnsi="Times New Roman" w:eastAsia="宋体"/>
+                <w:sz w:val="21"/>
+              </w:rPr>
+              <w:t>POI坐标偏移</w:t>
+            </w:r>
+          </w:p>
+        </w:tc>
+        <w:tc>
+          <w:tcPr>
+            <w:tcW w:type="dxa" w:w="2200"/>
+          </w:tcPr>
+          <w:p>
+            <w:r>
+              <w:rPr>
+                <w:rFonts w:ascii="Times New Roman" w:hAnsi="Times New Roman" w:eastAsia="宋体"/>
+                <w:sz w:val="21"/>
+              </w:rPr>
+              <w:t>直接用两套经纬度计算站点圈，最近地铁站POI中位距离476.3米</w:t>
+            </w:r>
+          </w:p>
+        </w:tc>
+        <w:tc>
+          <w:tcPr>
+            <w:tcW w:type="dxa" w:w="2300"/>
+          </w:tcPr>
+          <w:p>
+            <w:r>
+              <w:rPr>
+                <w:rFonts w:ascii="Times New Roman" w:hAnsi="Times New Roman" w:eastAsia="宋体"/>
+                <w:sz w:val="21"/>
+              </w:rPr>
+              <w:t>先将站点由WGS84转为GCJ-02，再计算距离</w:t>
+            </w:r>
+          </w:p>
+        </w:tc>
+        <w:tc>
+          <w:tcPr>
+            <w:tcW w:type="dxa" w:w="2056"/>
+          </w:tcPr>
+          <w:p>
+            <w:r>
+              <w:rPr>
+                <w:rFonts w:ascii="Times New Roman" w:hAnsi="Times New Roman" w:eastAsia="宋体"/>
+                <w:sz w:val="21"/>
+              </w:rPr>
+              <w:t>中位距离15.7米，298/302站在300米内匹配</w:t>
+            </w:r>
+          </w:p>
+        </w:tc>
+      </w:tr>
+      <w:tr>
+        <w:trPr>
+          <w:cantSplit/>
+        </w:trPr>
+        <w:tc>
+          <w:tcPr>
+            <w:tcW w:type="dxa" w:w="1750"/>
+          </w:tcPr>
+          <w:p>
+            <w:r>
+              <w:rPr>
+                <w:rFonts w:ascii="Times New Roman" w:hAnsi="Times New Roman" w:eastAsia="宋体"/>
+                <w:sz w:val="21"/>
+              </w:rPr>
+              <w:t>分析深度</w:t>
+            </w:r>
+          </w:p>
+        </w:tc>
+        <w:tc>
+          <w:tcPr>
+            <w:tcW w:type="dxa" w:w="2200"/>
+          </w:tcPr>
+          <w:p>
+            <w:r>
+              <w:rPr>
+                <w:rFonts w:ascii="Times New Roman" w:hAnsi="Times New Roman" w:eastAsia="宋体"/>
+                <w:sz w:val="21"/>
+              </w:rPr>
+              <w:t>仅计划POI数量和地图</w:t>
+            </w:r>
+          </w:p>
+        </w:tc>
+        <w:tc>
+          <w:tcPr>
+            <w:tcW w:type="dxa" w:w="2300"/>
+          </w:tcPr>
+          <w:p>
+            <w:r>
+              <w:rPr>
+                <w:rFonts w:ascii="Times New Roman" w:hAnsi="Times New Roman" w:eastAsia="宋体"/>
+                <w:sz w:val="21"/>
+              </w:rPr>
+              <w:t>增加Spearman区间、密度四分位、构成差和排名偏离</w:t>
+            </w:r>
+          </w:p>
+        </w:tc>
+        <w:tc>
+          <w:tcPr>
+            <w:tcW w:type="dxa" w:w="2056"/>
+          </w:tcPr>
+          <w:p>
+            <w:r>
+              <w:rPr>
+                <w:rFonts w:ascii="Times New Roman" w:hAnsi="Times New Roman" w:eastAsia="宋体"/>
+                <w:sz w:val="21"/>
+              </w:rPr>
+              <w:t>相关0.627，95%区间0.539—0.698，分组倍率3.30</w:t>
+            </w:r>
+          </w:p>
+        </w:tc>
+      </w:tr>
     </w:tbl>
     <w:p/>
     <w:p>
@@ -859,6 +997,70 @@
           <w:sz w:val="24"/>
         </w:rPr>
         <w:t>学号、成员对材料的阅读核验、另一台物理Windows电脑的断网运行和最终Word逐页校对仍需完成。不能为满足课程材料要求而伪造这些过程，也不能把本附件当作已经完成的人工贡献证明。</w:t>
+      </w:r>
+    </w:p>
+    <w:p/>
+    <w:p>
+      <w:pPr>
+        <w:pStyle w:val="1"/>
+      </w:pPr>
+      <w:r>
+        <w:rPr>
+          <w:rFonts w:ascii="Times New Roman" w:hAnsi="Times New Roman" w:eastAsia="宋体"/>
+          <w:b/>
+          <w:sz w:val="24"/>
+        </w:rPr>
+        <w:t>7 POI数据增补与分支整合</w:t>
+      </w:r>
+    </w:p>
+    <w:p>
+      <w:pPr/>
+      <w:r>
+        <w:rPr>
+          <w:rFonts w:ascii="Times New Roman" w:hAnsi="Times New Roman" w:eastAsia="宋体"/>
+          <w:sz w:val="24"/>
+        </w:rPr>
+        <w:t>用户原话包括：“整合github上的两个分支，直接修改本机文件”；“另外，添加POI数据分析”；“在完成上述所有代办工作后，整合两项工作并创建新分支后上传”；以及“项目负责人要求稍微分析得深入一点”。这些指令把POI和分支整合纳入开发范围，但没有要求把课程可选内容改写成课程必做。</w:t>
+      </w:r>
+    </w:p>
+    <w:p>
+      <w:pPr/>
+      <w:r>
+        <w:rPr>
+          <w:rFonts w:ascii="Times New Roman" w:hAnsi="Times New Roman" w:eastAsia="宋体"/>
+          <w:sz w:val="24"/>
+        </w:rPr>
+        <w:t>Codex分块读取296.8MB的POI文件，检查规模、字段、缺失、重复和坐标。电话缺失1,172,381行、TYPECODE缺失11,915行，但两列不用于核心分析；名称、地址、区县、一级类型和坐标完整。去除370条候选重复记录和四类地图标注后，保留1,303,199条功能POI。原文件不进入Git或代码ZIP。</w:t>
+      </w:r>
+    </w:p>
+    <w:p>
+      <w:pPr/>
+      <w:r>
+        <w:rPr>
+          <w:rFonts w:ascii="Times New Roman" w:hAnsi="Times New Roman" w:eastAsia="宋体"/>
+          <w:sz w:val="24"/>
+        </w:rPr>
+        <w:t>初版计算暴露出坐标系统问题：站点与最近“地铁站”POI的距离中位数约476.3米。把MetroFlow站点从WGS84转换到高德POI使用的GCJ-02后，中位数降到15.7米，298/302站在300米内匹配。这个前后差异成为修正依据，而不是只凭经验选择转换方法。</w:t>
+      </w:r>
+    </w:p>
+    <w:p>
+      <w:pPr/>
+      <w:r>
+        <w:rPr>
+          <w:rFonts w:ascii="Times New Roman" w:hAnsi="Times New Roman" w:eastAsia="宋体"/>
+          <w:sz w:val="24"/>
+        </w:rPr>
+        <w:t>为满足“分析稍微深入”，页面没有堆叠更多算法，而是围绕同一问题增加互补证据：Spearman相关与600次重复抽样95%区间、POI密度四等分的客流中位数、客流高低组的功能构成占比差，以及客流百分位与POI百分位的偏离站点。多样性相关区间跨0，因此报告主动保留“不足以形成稳定结论”的结果。</w:t>
+      </w:r>
+    </w:p>
+    <w:p>
+      <w:pPr/>
+      <w:r>
+        <w:rPr>
+          <w:rFonts w:ascii="Times New Roman" w:hAnsi="Times New Roman" w:eastAsia="宋体"/>
+          <w:sz w:val="24"/>
+        </w:rPr>
+        <w:t>远端main和version2没有共同祖先。Codex逐项比较后确认main已经覆盖旧分支的有效功能，并包含新版字体、布局、动画、数据目录和更多测试。最终做法是保留已验证实现，并用显式合并提交记录version2历史；这样既完成双分支整合，也不把旧路径和旧界面重新带入项目。最终测试、便携包大小和远端分支地址以《测试与验收记录》及Git提交为准。</w:t>
       </w:r>
     </w:p>
     <w:sectPr>

</xml_diff>